<commit_message>
fix: adding COM section, update output
</commit_message>
<xml_diff>
--- a/example/publishing/.output_example/PUBLISHING_SCHED_2026-06-29.docx
+++ b/example/publishing/.output_example/PUBLISHING_SCHED_2026-06-29.docx
@@ -1320,7 +1320,14 @@
         <w:pStyle w:val="FirstParagraph"/>
       </w:pPr>
       <w:r>
-        <w:t xml:space="preserve">The calendar module is the primary time-management surface of Personal Scheduler. It handles the creation, storage, display, and editing of time-bound entries called</w:t>
+        <w:rPr>
+          <w:b/>
+          <w:bCs/>
+        </w:rPr>
+        <w:t xml:space="preserve">Comment</w:t>
+      </w:r>
+      <w:r>
+        <w:t xml:space="preserve">: The calendar module is the primary time-management surface of Personal Scheduler. It handles the creation, storage, display, and editing of time-bound entries called</w:t>
       </w:r>
       <w:r>
         <w:t xml:space="preserve"> </w:t>
@@ -1341,7 +1348,14 @@
         <w:pStyle w:val="af3"/>
       </w:pPr>
       <w:r>
-        <w:t xml:space="preserve">Recurring events follow the RFC 5545 (iCalendar) recurrence rule syntax to ensure interoperability with third-party calendar applications. Event instances are materialized in the local store only when the relevant time window is displayed or queried, to avoid unbounded storage growth.</w:t>
+        <w:rPr>
+          <w:b/>
+          <w:bCs/>
+        </w:rPr>
+        <w:t xml:space="preserve">Comment</w:t>
+      </w:r>
+      <w:r>
+        <w:t xml:space="preserve">: Recurring events follow the RFC 5545 (iCalendar) recurrence rule syntax to ensure interoperability with third-party calendar applications. Event instances are materialized in the local store only when the relevant time window is displayed or queried, to avoid unbounded storage growth.</w:t>
       </w:r>
     </w:p>
     <w:p>
@@ -1891,7 +1905,14 @@
         <w:pStyle w:val="af3"/>
       </w:pPr>
       <w:r>
-        <w:t xml:space="preserve">When the user edits a single instance of a recurring event, the application must offer three choices: edit only this instance, edit this and all following instances, or edit all instances. This prevents accidental modification of the entire recurrence series.</w:t>
+        <w:rPr>
+          <w:b/>
+          <w:bCs/>
+        </w:rPr>
+        <w:t xml:space="preserve">Comment</w:t>
+      </w:r>
+      <w:r>
+        <w:t xml:space="preserve">: When the user edits a single instance of a recurring event, the application must offer three choices: edit only this instance, edit this and all following instances, or edit all instances. This prevents accidental modification of the entire recurrence series.</w:t>
       </w:r>
     </w:p>
     <w:p>

</xml_diff>